<commit_message>
Checking in 3sum, 4sum algs.
</commit_message>
<xml_diff>
--- a/DSA Patterns .docx
+++ b/DSA Patterns .docx
@@ -1061,7 +1061,7 @@
           <w:color w:val="1F1F1F"/>
           <w14:ligatures w14:val="standardContextual"/>
         </w:rPr>
-        <w:pict w14:anchorId="56040F1E">
+        <w:pict w14:anchorId="10A51DA4">
           <v:rect id="_x0000_i1026" style="width:0;height:1.5pt" o:hralign="center" o:hrstd="t" o:hrnoshade="t" o:hr="t" fillcolor="gray" stroked="f"/>
         </w:pict>
       </w:r>
@@ -1418,7 +1418,7 @@
           <w:color w:val="1F1F1F"/>
           <w14:ligatures w14:val="standardContextual"/>
         </w:rPr>
-        <w:pict w14:anchorId="14F61DD9">
+        <w:pict w14:anchorId="5E6A91DA">
           <v:rect id="_x0000_i1025" style="width:0;height:1.5pt" o:hralign="center" o:hrstd="t" o:hrnoshade="t" o:hr="t" fillcolor="gray" stroked="f"/>
         </w:pict>
       </w:r>
@@ -2711,7 +2711,139 @@
       </w:r>
     </w:p>
     <w:p/>
+    <w:p>
+      <w:r>
+        <w:t xml:space="preserve">###17. </w:t>
+      </w:r>
+      <w:r>
+        <w:t xml:space="preserve">Find </w:t>
+      </w:r>
+      <w:r>
+        <w:t xml:space="preserve">Zero sum </w:t>
+      </w:r>
+      <w:r>
+        <w:t>using three sum algorithms</w:t>
+      </w:r>
+    </w:p>
     <w:p/>
+    <w:p/>
+    <w:p>
+      <w:r>
+        <w:t>- **Core Pattern:** Two Pointers (after Sorting)</w:t>
+      </w:r>
+    </w:p>
+    <w:p>
+      <w:r>
+        <w:t>- **Problem:** Given an array of integers, find all unique triplets that sum to zero.</w:t>
+      </w:r>
+    </w:p>
+    <w:p>
+      <w:r>
+        <w:t>- **Technical Nuance:** Sorts the array, then for each element, uses two pointers to find pairs that sum to the negative of the current element. Skips duplicates to ensure unique triplets.</w:t>
+      </w:r>
+    </w:p>
+    <w:p>
+      <w:r>
+        <w:t>- **Complexity:**</w:t>
+      </w:r>
+    </w:p>
+    <w:p>
+      <w:r>
+        <w:t xml:space="preserve">  - Time: O(n²)</w:t>
+      </w:r>
+    </w:p>
+    <w:p>
+      <w:r>
+        <w:t xml:space="preserve">  - Space: O(1) (excluding output)</w:t>
+      </w:r>
+    </w:p>
+    <w:p/>
+    <w:p>
+      <w:r>
+        <w:t xml:space="preserve">--- </w:t>
+      </w:r>
+    </w:p>
+    <w:p/>
+    <w:p>
+      <w:r>
+        <w:t>###18. Find target using four sum algorithms</w:t>
+      </w:r>
+    </w:p>
+    <w:p/>
+    <w:p/>
+    <w:p>
+      <w:r>
+        <w:t>- **Core Pattern:** Two Pointers (after Sorting), Reduction to 2Sum/3Sum</w:t>
+      </w:r>
+    </w:p>
+    <w:p>
+      <w:r>
+        <w:t>- **Problem:** Given an array of integers, find all unique quadruplets that sum to a target value.</w:t>
+      </w:r>
+    </w:p>
+    <w:p>
+      <w:r>
+        <w:t>- **Technical Nuance:** Sorts the array, then fixes two numbers and uses two pointers to find pairs that sum to the remaining target. Skips duplicates to ensure unique quadruplets. Can be extended with pruning for efficiency.</w:t>
+      </w:r>
+    </w:p>
+    <w:p>
+      <w:r>
+        <w:t>- **Complexity:**</w:t>
+      </w:r>
+    </w:p>
+    <w:p>
+      <w:r>
+        <w:t xml:space="preserve">  - Time: O(n³)</w:t>
+      </w:r>
+    </w:p>
+    <w:p>
+      <w:r>
+        <w:t xml:space="preserve">  - Space: O(1) (excluding output)</w:t>
+      </w:r>
+    </w:p>
+    <w:p/>
+    <w:p>
+      <w:r>
+        <w:t xml:space="preserve">--- </w:t>
+      </w:r>
+    </w:p>
+    <w:p/>
+    <w:p>
+      <w:r>
+        <w:t>###19. 3 Sum Smaller</w:t>
+      </w:r>
+    </w:p>
+    <w:p/>
+    <w:p>
+      <w:r>
+        <w:t>- **Core Pattern:** Two Pointers (after Sorting)</w:t>
+      </w:r>
+    </w:p>
+    <w:p>
+      <w:r>
+        <w:t>- **Problem:** Given an array of integers and a target, count the number of triplets whose sum is less than the target.</w:t>
+      </w:r>
+    </w:p>
+    <w:p>
+      <w:r>
+        <w:t>- **Technical Nuance:** Sorts the array, then for each element, uses two pointers to efficiently count pairs that, together with the current element, sum to less than the target. Increments the count by (right - left) when a valid pair is found.</w:t>
+      </w:r>
+    </w:p>
+    <w:p>
+      <w:r>
+        <w:t>- **Complexity:**</w:t>
+      </w:r>
+    </w:p>
+    <w:p>
+      <w:r>
+        <w:t xml:space="preserve">  - Time: O(n²)</w:t>
+      </w:r>
+    </w:p>
+    <w:p>
+      <w:r>
+        <w:t xml:space="preserve">  - Space: O(1)</w:t>
+      </w:r>
+    </w:p>
     <w:sectPr>
       <w:pgSz w:w="12240" w:h="15840"/>
       <w:pgMar w:top="1440" w:right="1440" w:bottom="1440" w:left="1440" w:header="720" w:footer="720" w:gutter="0"/>

</xml_diff>

<commit_message>
Checking in count inversions alg
</commit_message>
<xml_diff>
--- a/DSA Patterns .docx
+++ b/DSA Patterns .docx
@@ -1061,7 +1061,7 @@
           <w:color w:val="1F1F1F"/>
           <w14:ligatures w14:val="standardContextual"/>
         </w:rPr>
-        <w:pict w14:anchorId="10A51DA4">
+        <w:pict w14:anchorId="0FA9EE11">
           <v:rect id="_x0000_i1026" style="width:0;height:1.5pt" o:hralign="center" o:hrstd="t" o:hrnoshade="t" o:hr="t" fillcolor="gray" stroked="f"/>
         </w:pict>
       </w:r>
@@ -1418,7 +1418,7 @@
           <w:color w:val="1F1F1F"/>
           <w14:ligatures w14:val="standardContextual"/>
         </w:rPr>
-        <w:pict w14:anchorId="5E6A91DA">
+        <w:pict w14:anchorId="46364941">
           <v:rect id="_x0000_i1025" style="width:0;height:1.5pt" o:hralign="center" o:hrstd="t" o:hrnoshade="t" o:hr="t" fillcolor="gray" stroked="f"/>
         </w:pict>
       </w:r>
@@ -2842,6 +2842,137 @@
     <w:p>
       <w:r>
         <w:t xml:space="preserve">  - Space: O(1)</w:t>
+      </w:r>
+    </w:p>
+    <w:p/>
+    <w:p>
+      <w:r>
+        <w:t xml:space="preserve">--- </w:t>
+      </w:r>
+    </w:p>
+    <w:p/>
+    <w:p>
+      <w:r>
+        <w:lastRenderedPageBreak/>
+        <w:t>###20. Squares of a sorted array</w:t>
+      </w:r>
+    </w:p>
+    <w:p/>
+    <w:p>
+      <w:r>
+        <w:t>- **Core Pattern:** Two Pointers</w:t>
+      </w:r>
+      <w:r>
+        <w:t>, heap</w:t>
+      </w:r>
+    </w:p>
+    <w:p>
+      <w:r>
+        <w:t>- **Problem:** Given a sorted array of integers (which may include negatives), return a sorted array of their squares.</w:t>
+      </w:r>
+    </w:p>
+    <w:p>
+      <w:r>
+        <w:t>- **Technical Nuance:** Uses two pointers at the start and end of the array. Compares the squares of both ends, placing the larger square at the end of the result array and moving pointers inward. This avoids the need for an extra sort and achieves linear time.</w:t>
+      </w:r>
+    </w:p>
+    <w:p>
+      <w:r>
+        <w:t>- **Complexity:**</w:t>
+      </w:r>
+    </w:p>
+    <w:p>
+      <w:r>
+        <w:t xml:space="preserve">  - Time: O(n)</w:t>
+      </w:r>
+    </w:p>
+    <w:p>
+      <w:r>
+        <w:t xml:space="preserve">  - Space: O(n)</w:t>
+      </w:r>
+    </w:p>
+    <w:p/>
+    <w:p>
+      <w:r>
+        <w:t xml:space="preserve">--- </w:t>
+      </w:r>
+    </w:p>
+    <w:p>
+      <w:r>
+        <w:t>### 21. Closest Triplet sum</w:t>
+      </w:r>
+    </w:p>
+    <w:p/>
+    <w:p>
+      <w:r>
+        <w:t>- **Core Pattern:** Two Pointers (after Sorting)</w:t>
+      </w:r>
+    </w:p>
+    <w:p>
+      <w:r>
+        <w:t>- **Problem:** Given a list of numbers and a target, find the triplet whose sum is closest to the target.</w:t>
+      </w:r>
+    </w:p>
+    <w:p>
+      <w:r>
+        <w:t>- **Technical Nuance:** Sorts the array, then for each element, uses two pointers to efficiently search for the closest sum. Updates the closest sum whenever a smaller difference is found.</w:t>
+      </w:r>
+    </w:p>
+    <w:p>
+      <w:r>
+        <w:t>- **Complexity:**</w:t>
+      </w:r>
+    </w:p>
+    <w:p>
+      <w:r>
+        <w:t xml:space="preserve">  - Time: O(n²)</w:t>
+      </w:r>
+    </w:p>
+    <w:p>
+      <w:r>
+        <w:t xml:space="preserve">  - Space: O(1)</w:t>
+      </w:r>
+    </w:p>
+    <w:p/>
+    <w:p>
+      <w:r>
+        <w:t xml:space="preserve">--- </w:t>
+      </w:r>
+    </w:p>
+    <w:p>
+      <w:r>
+        <w:t>### 22. Count inversions in an array</w:t>
+      </w:r>
+    </w:p>
+    <w:p/>
+    <w:p>
+      <w:r>
+        <w:t>- **Core Pattern:** Modified Merge Sort (Divide and Conquer)</w:t>
+      </w:r>
+    </w:p>
+    <w:p>
+      <w:r>
+        <w:t>- **Problem:** Given an array, count the number of inversions (pairs (i, j) where i &lt; j and arr[i] &gt; arr[j]).</w:t>
+      </w:r>
+    </w:p>
+    <w:p>
+      <w:r>
+        <w:t>- **Technical Nuance:** Uses merge sort to count inversions while sorting. During the merge step, whenever an element from the right half is placed before an element from the left half, it counts as an inversion for all remaining elements in the left half.</w:t>
+      </w:r>
+    </w:p>
+    <w:p>
+      <w:r>
+        <w:t>- **Complexity:**</w:t>
+      </w:r>
+    </w:p>
+    <w:p>
+      <w:r>
+        <w:t xml:space="preserve">  - Time: O(n log n)</w:t>
+      </w:r>
+    </w:p>
+    <w:p>
+      <w:r>
+        <w:t xml:space="preserve">  - Space: O(n)</w:t>
       </w:r>
     </w:p>
     <w:sectPr>

</xml_diff>